<commit_message>
Sponsorship rebate: one name, flat 7.5%
The 5-10% negotiable band and the rebate_rate parameter are gone; the
rate is REBATE_RATE = 0.075 and nobody's to change per request (a
rebate_rate on the query string is ignored). 'Scholarship fund' and
'sponsorship pot' are retired in favour of 'sponsorship rebate' in code,
payloads (rebate_display, returned_cents, rebate_balance_cents), README,
tests and the go-to-market document. The ledger, balance and spend
endpoints are unchanged; URL paths kept for compatibility.
</commit_message>
<xml_diff>
--- a/ops/gtm/0FFDAYS-GTM-Lacrosse-Nashville-2031.docx
+++ b/ops/gtm/0FFDAYS-GTM-Lacrosse-Nashville-2031.docx
@@ -409,7 +409,7 @@
           </w:tcPr>
           <w:p>
             <w:r>
-              <w:t>$0.50 per rostered athlete per day between the season dates the director sets. Late joiners from the day added. Sponsorship rebate 5-10% back to the club as a scholarship fund.</w:t>
+              <w:t>$0.50 per rostered athlete per day between the season dates the director sets. Late joiners from the day added. Flat 7.5% sponsorship rebate back to the club as a spendable balance.</w:t>
             </w:r>
           </w:p>
         </w:tc>
@@ -1708,7 +1708,7 @@
           </w:tcPr>
           <w:p>
             <w:r>
-              <w:t>Sponsorship rebate (7.5%)</w:t>
+              <w:t>Sponsorship rebate (flat 7.5%)</w:t>
             </w:r>
           </w:p>
         </w:tc>
@@ -1730,7 +1730,7 @@
           </w:tcPr>
           <w:p>
             <w:r>
-              <w:t>Into the club's scholarship fund</w:t>
+              <w:t>Returned to the club (margin + rebate)</w:t>
             </w:r>
           </w:p>
         </w:tc>
@@ -1773,12 +1773,12 @@
         <w:pStyle w:val="Heading2"/>
       </w:pPr>
       <w:r>
-        <w:t>The rebate is a fund, not a discount</w:t>
+        <w:t>The sponsorship rebate is a balance, not a discount</w:t>
       </w:r>
     </w:p>
     <w:p>
       <w:r>
-        <w:t>Five to ten percent of what a club pays comes back, earmarked for families who cannot afford the season. It is kept as a ledger with a balance, not netted off the invoice: a discount disappears into a smaller number nobody looks at, while a fund is something a director points at in a board meeting and spends on a named family. The rate is a negotiating lever inside a bounded band; what it is for is not negotiable.</w:t>
+        <w:t>A flat 7.5% of what a club pays comes back to the club as the sponsorship rebate, typically spent on families who cannot afford the season. It is kept as a ledger with a balance, not netted off the invoice: a discount disappears into a smaller number nobody looks at, while a balance is something a director points at in a board meeting and spends on a named family, and the ledger records what it went to. The rate is flat on purpose: one number every club gets, never a negotiation and never a volume discount in disguise.</w:t>
       </w:r>
     </w:p>
     <w:p>
@@ -1941,7 +1941,7 @@
           </w:tcPr>
           <w:p>
             <w:r>
-              <w:t>A reason the club is better than the one down the road; a scholarship story for the board; nothing new to administer.</w:t>
+              <w:t>A reason the club is better than the one down the road; a sponsorship rebate for the board; nothing new to administer.</w:t>
             </w:r>
           </w:p>
         </w:tc>
@@ -1951,7 +1951,7 @@
           </w:tcPr>
           <w:p>
             <w:r>
-              <w:t>A line on dues, a fund with a balance, a season card, the parent list, one invoice.</w:t>
+              <w:t>A line on dues, a rebate with a balance, a season card, the parent list, one invoice.</w:t>
             </w:r>
           </w:p>
         </w:tc>
@@ -2431,7 +2431,7 @@
     </w:p>
     <w:p>
       <w:r>
-        <w:t>Getting parents to say yes is a pilot task. The place to make the case is the invite email and the first team meeting, in the club's voice: the sponsors fund the scholarship pot; the switch is what lets them reach you; here is what they will and will not do with it.</w:t>
+        <w:t>Getting parents to say yes is a pilot task. The place to make the case is the invite email and the first team meeting, in the club's voice: the sponsors fund the rebate the club spends on families; the switch is what lets them reach you; here is what they will and will not do with it.</w:t>
       </w:r>
     </w:p>
     <w:p>
@@ -2929,7 +2929,7 @@
           </w:tcPr>
           <w:p>
             <w:r>
-              <w:t>Director shown the invoice line and the fund balance in a sit-down. Asked the one question.</w:t>
+              <w:t>Director shown the invoice line and the rebate balance in a sit-down. Asked the one question.</w:t>
             </w:r>
           </w:p>
         </w:tc>
@@ -3019,7 +3019,7 @@
     </w:p>
     <w:p>
       <w:r>
-        <w:t>"Our 2031s did more wall ball in February than they did all last spring, we could see it, it cost the club nothing, and the scholarship fund paid for two kids' seasons."</w:t>
+        <w:t>"Our 2031s did more wall ball in February than they did all last spring, we could see it, it cost the club nothing, and the sponsorship rebate paid for two kids' seasons."</w:t>
       </w:r>
     </w:p>
     <w:p>

</xml_diff>

<commit_message>
No automatic sponsorship rebate: granted one club at a time by the operator
organizations.sponsorship_rebate_rate, zero by default, bounded at 25%,
set only by scripts/set_rebate.py (--list / --org N --rate 0.075 / --rate
0 to withdraw). No director-facing route can change it, tested. Invoices
and accruals read the club's own rate; a club with none sees no rebate
line and nothing accrues. Withdrawing the rate leaves what was already
credited. README, pricing payload and the go-to-market document now say
the standard price has no rebate and Nashville Dogs is a candidate for a
one-off. Schema 18.
</commit_message>
<xml_diff>
--- a/ops/gtm/0FFDAYS-GTM-Lacrosse-Nashville-2031.docx
+++ b/ops/gtm/0FFDAYS-GTM-Lacrosse-Nashville-2031.docx
@@ -409,7 +409,7 @@
           </w:tcPr>
           <w:p>
             <w:r>
-              <w:t>$0.50 per rostered athlete per day between the season dates the director sets. Late joiners from the day added. Flat 7.5% sponsorship rebate back to the club as a spendable balance.</w:t>
+              <w:t>$0.50 per rostered athlete per day between the season dates the director sets. Late joiners from the day added. A sponsorship rebate can be granted to a club one-off by the operator; none by default.</w:t>
             </w:r>
           </w:p>
         </w:tc>
@@ -1686,7 +1686,7 @@
           </w:tcPr>
           <w:p>
             <w:r>
-              <w:t>Club margin</w:t>
+              <w:t>Club margin, theirs to keep</w:t>
             </w:r>
           </w:p>
         </w:tc>
@@ -1697,50 +1697,6 @@
           <w:p>
             <w:r>
               <w:t>$5,000</w:t>
-            </w:r>
-          </w:p>
-        </w:tc>
-      </w:tr>
-      <w:tr>
-        <w:tc>
-          <w:tcPr>
-            <w:tcW w:type="dxa" w:w="4873"/>
-          </w:tcPr>
-          <w:p>
-            <w:r>
-              <w:t>Sponsorship rebate (flat 7.5%)</w:t>
-            </w:r>
-          </w:p>
-        </w:tc>
-        <w:tc>
-          <w:tcPr>
-            <w:tcW w:type="dxa" w:w="4873"/>
-          </w:tcPr>
-          <w:p>
-            <w:r>
-              <w:t>$2,812.50</w:t>
-            </w:r>
-          </w:p>
-        </w:tc>
-      </w:tr>
-      <w:tr>
-        <w:tc>
-          <w:tcPr>
-            <w:tcW w:type="dxa" w:w="4873"/>
-          </w:tcPr>
-          <w:p>
-            <w:r>
-              <w:t>Returned to the club (margin + rebate)</w:t>
-            </w:r>
-          </w:p>
-        </w:tc>
-        <w:tc>
-          <w:tcPr>
-            <w:tcW w:type="dxa" w:w="4873"/>
-          </w:tcPr>
-          <w:p>
-            <w:r>
-              <w:t>$7,812.50</w:t>
             </w:r>
           </w:p>
         </w:tc>
@@ -1773,12 +1729,12 @@
         <w:pStyle w:val="Heading2"/>
       </w:pPr>
       <w:r>
-        <w:t>The sponsorship rebate is a balance, not a discount</w:t>
+        <w:t>The sponsorship rebate: granted one club at a time, never automatic</w:t>
       </w:r>
     </w:p>
     <w:p>
       <w:r>
-        <w:t>A flat 7.5% of what a club pays comes back to the club as the sponsorship rebate, typically spent on families who cannot afford the season. It is kept as a ledger with a balance, not netted off the invoice: a discount disappears into a smaller number nobody looks at, while a balance is something a director points at in a board meeting and spends on a named family, and the ledger records what it went to. The rate is flat on purpose: one number every club gets, never a negotiation and never a volume discount in disguise.</w:t>
+        <w:t>There is no rebate in the standard price. Where it makes commercial sense -- a flagship club, a reference account, a program that brings two others -- the operator can grant that one club a sponsorship rebate: a share of what it pays returned as a balance the director can spend, typically on a family who cannot afford the season. It is set per organisation by an operator script, defaults to zero, is bounded at 25%, and no director can switch it on. Where granted it is kept as a ledger with a balance rather than netted off the invoice, and the ledger records what it was spent on. Nashville Dogs is the obvious candidate for one; the decision is deliberately not pre-made in this document.</w:t>
       </w:r>
     </w:p>
     <w:p>
@@ -1941,7 +1897,7 @@
           </w:tcPr>
           <w:p>
             <w:r>
-              <w:t>A reason the club is better than the one down the road; a sponsorship rebate for the board; nothing new to administer.</w:t>
+              <w:t>A reason the club is better than the one down the road; a margin from the dues line for the board; nothing new to administer.</w:t>
             </w:r>
           </w:p>
         </w:tc>
@@ -1951,7 +1907,7 @@
           </w:tcPr>
           <w:p>
             <w:r>
-              <w:t>A line on dues, a rebate with a balance, a season card, the parent list, one invoice.</w:t>
+              <w:t>A line on dues with a margin, a season card, the parent list, one invoice.</w:t>
             </w:r>
           </w:p>
         </w:tc>
@@ -2431,7 +2387,7 @@
     </w:p>
     <w:p>
       <w:r>
-        <w:t>Getting parents to say yes is a pilot task. The place to make the case is the invite email and the first team meeting, in the club's voice: the sponsors fund the rebate the club spends on families; the switch is what lets them reach you; here is what they will and will not do with it.</w:t>
+        <w:t>Getting parents to say yes is a pilot task. The place to make the case is the invite email and the first team meeting, in the club's voice: the sponsors help keep the season affordable; the switch is what lets them reach you; here is what they will and will not do with it.</w:t>
       </w:r>
     </w:p>
     <w:p>
@@ -2929,7 +2885,7 @@
           </w:tcPr>
           <w:p>
             <w:r>
-              <w:t>Director shown the invoice line and the rebate balance in a sit-down. Asked the one question.</w:t>
+              <w:t>Director shown the invoice line and the dues margin in a sit-down. Asked the one question.</w:t>
             </w:r>
           </w:p>
         </w:tc>
@@ -3019,7 +2975,7 @@
     </w:p>
     <w:p>
       <w:r>
-        <w:t>"Our 2031s did more wall ball in February than they did all last spring, we could see it, it cost the club nothing, and the sponsorship rebate paid for two kids' seasons."</w:t>
+        <w:t>"Our 2031s did more wall ball in February than they did all last spring, we could see it, and it cost the club nothing."</w:t>
       </w:r>
     </w:p>
     <w:p>

</xml_diff>